<commit_message>
Styled website, added to Dev Diary
</commit_message>
<xml_diff>
--- a/Development Diary.docx
+++ b/Development Diary.docx
@@ -1,6 +1,6 @@
 
 <file path=word/document.xml><?xml version="1.0" encoding="utf-8"?>
-<w:document xmlns:wpc="http://schemas.microsoft.com/office/word/2010/wordprocessingCanvas" xmlns:cx="http://schemas.microsoft.com/office/drawing/2014/chartex" xmlns:cx1="http://schemas.microsoft.com/office/drawing/2015/9/8/chartex" xmlns:cx2="http://schemas.microsoft.com/office/drawing/2015/10/21/chartex" xmlns:cx3="http://schemas.microsoft.com/office/drawing/2016/5/9/chartex" xmlns:cx4="http://schemas.microsoft.com/office/drawing/2016/5/10/chartex" xmlns:cx5="http://schemas.microsoft.com/office/drawing/2016/5/11/chartex" xmlns:cx6="http://schemas.microsoft.com/office/drawing/2016/5/12/chartex" xmlns:cx7="http://schemas.microsoft.com/office/drawing/2016/5/13/chartex" xmlns:cx8="http://schemas.microsoft.com/office/drawing/2016/5/14/chartex" xmlns:mc="http://schemas.openxmlformats.org/markup-compatibility/2006" xmlns:aink="http://schemas.microsoft.com/office/drawing/2016/ink" xmlns:am3d="http://schemas.microsoft.com/office/drawing/2017/model3d" xmlns:o="urn:schemas-microsoft-com:office:office" xmlns:r="http://schemas.openxmlformats.org/officeDocument/2006/relationships" xmlns:m="http://schemas.openxmlformats.org/officeDocument/2006/math" xmlns:v="urn:schemas-microsoft-com:vml" xmlns:wp14="http://schemas.microsoft.com/office/word/2010/wordprocessingDrawing" xmlns:wp="http://schemas.openxmlformats.org/drawingml/2006/wordprocessingDrawing" xmlns:w10="urn:schemas-microsoft-com:office:word" xmlns:w="http://schemas.openxmlformats.org/wordprocessingml/2006/main" xmlns:w14="http://schemas.microsoft.com/office/word/2010/wordml" xmlns:w15="http://schemas.microsoft.com/office/word/2012/wordml" xmlns:w16cex="http://schemas.microsoft.com/office/word/2018/wordml/cex" xmlns:w16cid="http://schemas.microsoft.com/office/word/2016/wordml/cid" xmlns:w16="http://schemas.microsoft.com/office/word/2018/wordml" xmlns:w16sdtdh="http://schemas.microsoft.com/office/word/2020/wordml/sdtdatahash" xmlns:w16se="http://schemas.microsoft.com/office/word/2015/wordml/symex" xmlns:wpg="http://schemas.microsoft.com/office/word/2010/wordprocessingGroup" xmlns:wpi="http://schemas.microsoft.com/office/word/2010/wordprocessingInk" xmlns:wne="http://schemas.microsoft.com/office/word/2006/wordml" xmlns:wps="http://schemas.microsoft.com/office/word/2010/wordprocessingShape" mc:Ignorable="w14 w15 w16se w16cid w16 w16cex w16sdtdh wp14">
+<w:document xmlns:wpc="http://schemas.microsoft.com/office/word/2010/wordprocessingCanvas" xmlns:cx="http://schemas.microsoft.com/office/drawing/2014/chartex" xmlns:cx1="http://schemas.microsoft.com/office/drawing/2015/9/8/chartex" xmlns:cx2="http://schemas.microsoft.com/office/drawing/2015/10/21/chartex" xmlns:cx3="http://schemas.microsoft.com/office/drawing/2016/5/9/chartex" xmlns:cx4="http://schemas.microsoft.com/office/drawing/2016/5/10/chartex" xmlns:cx5="http://schemas.microsoft.com/office/drawing/2016/5/11/chartex" xmlns:cx6="http://schemas.microsoft.com/office/drawing/2016/5/12/chartex" xmlns:cx7="http://schemas.microsoft.com/office/drawing/2016/5/13/chartex" xmlns:cx8="http://schemas.microsoft.com/office/drawing/2016/5/14/chartex" xmlns:mc="http://schemas.openxmlformats.org/markup-compatibility/2006" xmlns:aink="http://schemas.microsoft.com/office/drawing/2016/ink" xmlns:am3d="http://schemas.microsoft.com/office/drawing/2017/model3d" xmlns:o="urn:schemas-microsoft-com:office:office" xmlns:oel="http://schemas.microsoft.com/office/2019/extlst" xmlns:r="http://schemas.openxmlformats.org/officeDocument/2006/relationships" xmlns:m="http://schemas.openxmlformats.org/officeDocument/2006/math" xmlns:v="urn:schemas-microsoft-com:vml" xmlns:wp14="http://schemas.microsoft.com/office/word/2010/wordprocessingDrawing" xmlns:wp="http://schemas.openxmlformats.org/drawingml/2006/wordprocessingDrawing" xmlns:w10="urn:schemas-microsoft-com:office:word" xmlns:w="http://schemas.openxmlformats.org/wordprocessingml/2006/main" xmlns:w14="http://schemas.microsoft.com/office/word/2010/wordml" xmlns:w15="http://schemas.microsoft.com/office/word/2012/wordml" xmlns:w16cex="http://schemas.microsoft.com/office/word/2018/wordml/cex" xmlns:w16cid="http://schemas.microsoft.com/office/word/2016/wordml/cid" xmlns:w16="http://schemas.microsoft.com/office/word/2018/wordml" xmlns:w16sdtdh="http://schemas.microsoft.com/office/word/2020/wordml/sdtdatahash" xmlns:w16se="http://schemas.microsoft.com/office/word/2015/wordml/symex" xmlns:wpg="http://schemas.microsoft.com/office/word/2010/wordprocessingGroup" xmlns:wpi="http://schemas.microsoft.com/office/word/2010/wordprocessingInk" xmlns:wne="http://schemas.microsoft.com/office/word/2006/wordml" xmlns:wps="http://schemas.microsoft.com/office/word/2010/wordprocessingShape" mc:Ignorable="w14 w15 w16se w16cid w16 w16cex w16sdtdh wp14">
   <w:body>
     <w:p>
       <w:pPr>
@@ -82,6 +82,7 @@
           <w:rFonts w:ascii="Cambria" w:hAnsi="Cambria"/>
           <w:b/>
           <w:bCs/>
+          <w:noProof/>
           <w:sz w:val="24"/>
           <w:szCs w:val="24"/>
         </w:rPr>
@@ -167,6 +168,7 @@
           <w:rFonts w:ascii="Cambria" w:hAnsi="Cambria"/>
           <w:b/>
           <w:bCs/>
+          <w:noProof/>
           <w:sz w:val="24"/>
           <w:szCs w:val="24"/>
         </w:rPr>
@@ -242,6 +244,7 @@
           <w:rFonts w:ascii="Cambria" w:hAnsi="Cambria"/>
           <w:b/>
           <w:bCs/>
+          <w:noProof/>
           <w:sz w:val="24"/>
           <w:szCs w:val="24"/>
         </w:rPr>
@@ -350,6 +353,7 @@
           <w:rFonts w:ascii="Cambria" w:hAnsi="Cambria"/>
           <w:b/>
           <w:bCs/>
+          <w:noProof/>
           <w:sz w:val="24"/>
           <w:szCs w:val="24"/>
         </w:rPr>
@@ -399,17 +403,7 @@
           <w:sz w:val="24"/>
           <w:szCs w:val="24"/>
         </w:rPr>
-        <w:t>T</w:t>
-      </w:r>
-      <w:r>
-        <w:rPr>
-          <w:rFonts w:ascii="Cambria" w:hAnsi="Cambria"/>
-          <w:b/>
-          <w:bCs/>
-          <w:sz w:val="24"/>
-          <w:szCs w:val="24"/>
-        </w:rPr>
-        <w:t>hen added my first migration, called it “</w:t>
+        <w:t>Then added my first migration, called it “</w:t>
       </w:r>
       <w:proofErr w:type="spellStart"/>
       <w:r>
@@ -449,6 +443,7 @@
           <w:rFonts w:ascii="Cambria" w:hAnsi="Cambria"/>
           <w:b/>
           <w:bCs/>
+          <w:noProof/>
           <w:sz w:val="24"/>
           <w:szCs w:val="24"/>
         </w:rPr>
@@ -499,27 +494,15 @@
           <w:szCs w:val="24"/>
         </w:rPr>
       </w:pPr>
-      <w:proofErr w:type="gramStart"/>
-      <w:r>
-        <w:rPr>
-          <w:rFonts w:ascii="Cambria" w:hAnsi="Cambria"/>
-          <w:b/>
-          <w:bCs/>
-          <w:sz w:val="24"/>
-          <w:szCs w:val="24"/>
-        </w:rPr>
-        <w:t>Next</w:t>
-      </w:r>
-      <w:proofErr w:type="gramEnd"/>
-      <w:r>
-        <w:rPr>
-          <w:rFonts w:ascii="Cambria" w:hAnsi="Cambria"/>
-          <w:b/>
-          <w:bCs/>
-          <w:sz w:val="24"/>
-          <w:szCs w:val="24"/>
-        </w:rPr>
-        <w:t xml:space="preserve"> I got to work with adding </w:t>
+      <w:r>
+        <w:rPr>
+          <w:rFonts w:ascii="Cambria" w:hAnsi="Cambria"/>
+          <w:b/>
+          <w:bCs/>
+          <w:sz w:val="24"/>
+          <w:szCs w:val="24"/>
+        </w:rPr>
+        <w:t xml:space="preserve">Next I got to work with adding </w:t>
       </w:r>
       <w:r>
         <w:rPr>
@@ -556,6 +539,7 @@
           <w:rFonts w:ascii="Cambria" w:hAnsi="Cambria"/>
           <w:b/>
           <w:bCs/>
+          <w:noProof/>
           <w:sz w:val="24"/>
           <w:szCs w:val="24"/>
         </w:rPr>
@@ -643,6 +627,7 @@
           <w:rFonts w:ascii="Cambria" w:hAnsi="Cambria"/>
           <w:b/>
           <w:bCs/>
+          <w:noProof/>
           <w:sz w:val="24"/>
           <w:szCs w:val="24"/>
         </w:rPr>
@@ -728,6 +713,7 @@
           <w:rFonts w:ascii="Cambria" w:hAnsi="Cambria"/>
           <w:b/>
           <w:bCs/>
+          <w:noProof/>
           <w:sz w:val="24"/>
           <w:szCs w:val="24"/>
         </w:rPr>
@@ -853,6 +839,7 @@
           <w:rFonts w:ascii="Cambria" w:hAnsi="Cambria"/>
           <w:b/>
           <w:bCs/>
+          <w:noProof/>
           <w:sz w:val="24"/>
           <w:szCs w:val="24"/>
         </w:rPr>
@@ -911,7 +898,6 @@
           <w:sz w:val="24"/>
           <w:szCs w:val="24"/>
         </w:rPr>
-        <w:lastRenderedPageBreak/>
         <w:t>I then added authorization to the controllers to make sure only authorized users could view them</w:t>
       </w:r>
       <w:r>
@@ -922,29 +908,7 @@
           <w:sz w:val="24"/>
           <w:szCs w:val="24"/>
         </w:rPr>
-        <w:t xml:space="preserve"> using industry standard authorization, non-logged in users can’t see past the home page, users </w:t>
-      </w:r>
-      <w:proofErr w:type="gramStart"/>
-      <w:r>
-        <w:rPr>
-          <w:rFonts w:ascii="Cambria" w:hAnsi="Cambria"/>
-          <w:b/>
-          <w:bCs/>
-          <w:sz w:val="24"/>
-          <w:szCs w:val="24"/>
-        </w:rPr>
-        <w:t>cant</w:t>
-      </w:r>
-      <w:proofErr w:type="gramEnd"/>
-      <w:r>
-        <w:rPr>
-          <w:rFonts w:ascii="Cambria" w:hAnsi="Cambria"/>
-          <w:b/>
-          <w:bCs/>
-          <w:sz w:val="24"/>
-          <w:szCs w:val="24"/>
-        </w:rPr>
-        <w:t xml:space="preserve"> see other users bookings but only theirs. and staff members can see all bookings that have been created, and edit or delete them. Securing the website fully.</w:t>
+        <w:t xml:space="preserve"> using industry standard authorization, non-logged in users can’t see past the home page, users cant see other users bookings but only theirs. and staff members can see all bookings that have been created, and edit or delete them. Securing the website fully.</w:t>
       </w:r>
     </w:p>
     <w:p>
@@ -1336,29 +1300,7 @@
           <w:szCs w:val="24"/>
         </w:rPr>
         <w:br/>
-        <w:t xml:space="preserve">I realised that I had made a mistake in my </w:t>
-      </w:r>
-      <w:proofErr w:type="gramStart"/>
-      <w:r>
-        <w:rPr>
-          <w:rFonts w:ascii="Cambria" w:hAnsi="Cambria"/>
-          <w:b/>
-          <w:bCs/>
-          <w:sz w:val="24"/>
-          <w:szCs w:val="24"/>
-        </w:rPr>
-        <w:t>bookings</w:t>
-      </w:r>
-      <w:proofErr w:type="gramEnd"/>
-      <w:r>
-        <w:rPr>
-          <w:rFonts w:ascii="Cambria" w:hAnsi="Cambria"/>
-          <w:b/>
-          <w:bCs/>
-          <w:sz w:val="24"/>
-          <w:szCs w:val="24"/>
-        </w:rPr>
-        <w:t xml:space="preserve"> controller, calling </w:t>
+        <w:t xml:space="preserve">I realised that I had made a mistake in my bookings controller, calling </w:t>
       </w:r>
       <w:proofErr w:type="spellStart"/>
       <w:r>
@@ -1531,14 +1473,14 @@
           <w:sz w:val="24"/>
           <w:szCs w:val="24"/>
         </w:rPr>
-        <w:lastRenderedPageBreak/>
-        <w:br/>
-      </w:r>
-      <w:r>
-        <w:rPr>
-          <w:rFonts w:ascii="Cambria" w:hAnsi="Cambria"/>
-          <w:b/>
-          <w:bCs/>
+        <w:br/>
+      </w:r>
+      <w:r>
+        <w:rPr>
+          <w:rFonts w:ascii="Cambria" w:hAnsi="Cambria"/>
+          <w:b/>
+          <w:bCs/>
+          <w:noProof/>
           <w:sz w:val="24"/>
           <w:szCs w:val="24"/>
         </w:rPr>
@@ -1644,6 +1586,7 @@
           <w:rFonts w:ascii="Cambria" w:hAnsi="Cambria"/>
           <w:b/>
           <w:bCs/>
+          <w:noProof/>
           <w:sz w:val="24"/>
           <w:szCs w:val="24"/>
         </w:rPr>
@@ -1708,6 +1651,7 @@
           <w:rFonts w:ascii="Cambria" w:hAnsi="Cambria"/>
           <w:b/>
           <w:bCs/>
+          <w:noProof/>
           <w:sz w:val="24"/>
           <w:szCs w:val="24"/>
         </w:rPr>
@@ -1912,58 +1856,6 @@
     </w:p>
     <w:p>
       <w:pPr>
-        <w:pStyle w:val="ListParagraph"/>
-        <w:numPr>
-          <w:ilvl w:val="0"/>
-          <w:numId w:val="3"/>
-        </w:numPr>
-        <w:rPr>
-          <w:rFonts w:ascii="Cambria" w:hAnsi="Cambria"/>
-          <w:b/>
-          <w:bCs/>
-          <w:sz w:val="24"/>
-          <w:szCs w:val="24"/>
-        </w:rPr>
-      </w:pPr>
-      <w:r>
-        <w:rPr>
-          <w:rFonts w:ascii="Cambria" w:hAnsi="Cambria"/>
-          <w:b/>
-          <w:bCs/>
-          <w:sz w:val="24"/>
-          <w:szCs w:val="24"/>
-        </w:rPr>
-        <w:t>Implement accessibility features</w:t>
-      </w:r>
-    </w:p>
-    <w:p>
-      <w:pPr>
-        <w:pStyle w:val="ListParagraph"/>
-        <w:numPr>
-          <w:ilvl w:val="0"/>
-          <w:numId w:val="3"/>
-        </w:numPr>
-        <w:rPr>
-          <w:rFonts w:ascii="Cambria" w:hAnsi="Cambria"/>
-          <w:b/>
-          <w:bCs/>
-          <w:sz w:val="24"/>
-          <w:szCs w:val="24"/>
-        </w:rPr>
-      </w:pPr>
-      <w:r>
-        <w:rPr>
-          <w:rFonts w:ascii="Cambria" w:hAnsi="Cambria"/>
-          <w:b/>
-          <w:bCs/>
-          <w:sz w:val="24"/>
-          <w:szCs w:val="24"/>
-        </w:rPr>
-        <w:t>Add styles and java script functionality</w:t>
-      </w:r>
-    </w:p>
-    <w:p>
-      <w:pPr>
         <w:ind w:left="360"/>
         <w:rPr>
           <w:rFonts w:ascii="Cambria" w:hAnsi="Cambria"/>
@@ -2040,6 +1932,7 @@
           <w:rFonts w:ascii="Cambria" w:hAnsi="Cambria"/>
           <w:b/>
           <w:bCs/>
+          <w:noProof/>
           <w:sz w:val="24"/>
           <w:szCs w:val="24"/>
         </w:rPr>
@@ -2090,6 +1983,39 @@
           <w:szCs w:val="24"/>
         </w:rPr>
       </w:pPr>
+    </w:p>
+    <w:p>
+      <w:pPr>
+        <w:rPr>
+          <w:rFonts w:ascii="Cambria" w:hAnsi="Cambria"/>
+          <w:b/>
+          <w:bCs/>
+          <w:sz w:val="24"/>
+          <w:szCs w:val="24"/>
+        </w:rPr>
+      </w:pPr>
+      <w:r>
+        <w:rPr>
+          <w:rFonts w:ascii="Cambria" w:hAnsi="Cambria"/>
+          <w:b/>
+          <w:bCs/>
+          <w:sz w:val="24"/>
+          <w:szCs w:val="24"/>
+        </w:rPr>
+        <w:t>Day 4:</w:t>
+      </w:r>
+    </w:p>
+    <w:p>
+      <w:pPr>
+        <w:rPr>
+          <w:rFonts w:ascii="Cambria" w:hAnsi="Cambria"/>
+          <w:b/>
+          <w:bCs/>
+          <w:color w:val="FF0000"/>
+          <w:sz w:val="24"/>
+          <w:szCs w:val="24"/>
+        </w:rPr>
+      </w:pPr>
       <w:r>
         <w:rPr>
           <w:rFonts w:ascii="Cambria" w:hAnsi="Cambria"/>
@@ -2109,6 +2035,798 @@
           <w:szCs w:val="24"/>
         </w:rPr>
         <w:br/>
+      </w:r>
+      <w:r>
+        <w:rPr>
+          <w:rFonts w:ascii="Cambria" w:hAnsi="Cambria"/>
+          <w:b/>
+          <w:bCs/>
+          <w:sz w:val="24"/>
+          <w:szCs w:val="24"/>
+        </w:rPr>
+        <w:br/>
+        <w:t>While testing the login functions and roles I found out that customer roles had the create edit and delete buttons on the rooms page</w:t>
+      </w:r>
+      <w:r>
+        <w:rPr>
+          <w:rFonts w:ascii="Cambria" w:hAnsi="Cambria"/>
+          <w:b/>
+          <w:bCs/>
+          <w:sz w:val="24"/>
+          <w:szCs w:val="24"/>
+        </w:rPr>
+        <w:br/>
+      </w:r>
+      <w:r>
+        <w:rPr>
+          <w:rFonts w:ascii="Cambria" w:hAnsi="Cambria"/>
+          <w:b/>
+          <w:bCs/>
+          <w:sz w:val="24"/>
+          <w:szCs w:val="24"/>
+        </w:rPr>
+        <w:drawing>
+          <wp:inline distT="0" distB="0" distL="0" distR="0" wp14:anchorId="1BFF9517" wp14:editId="20EBDFBC">
+            <wp:extent cx="5731510" cy="2982595"/>
+            <wp:effectExtent l="0" t="0" r="2540" b="8255"/>
+            <wp:docPr id="11" name="Picture 11"/>
+            <wp:cNvGraphicFramePr>
+              <a:graphicFrameLocks xmlns:a="http://schemas.openxmlformats.org/drawingml/2006/main" noChangeAspect="1"/>
+            </wp:cNvGraphicFramePr>
+            <a:graphic xmlns:a="http://schemas.openxmlformats.org/drawingml/2006/main">
+              <a:graphicData uri="http://schemas.openxmlformats.org/drawingml/2006/picture">
+                <pic:pic xmlns:pic="http://schemas.openxmlformats.org/drawingml/2006/picture">
+                  <pic:nvPicPr>
+                    <pic:cNvPr id="1" name=""/>
+                    <pic:cNvPicPr/>
+                  </pic:nvPicPr>
+                  <pic:blipFill>
+                    <a:blip r:embed="rId18"/>
+                    <a:stretch>
+                      <a:fillRect/>
+                    </a:stretch>
+                  </pic:blipFill>
+                  <pic:spPr>
+                    <a:xfrm>
+                      <a:off x="0" y="0"/>
+                      <a:ext cx="5731510" cy="2982595"/>
+                    </a:xfrm>
+                    <a:prstGeom prst="rect">
+                      <a:avLst/>
+                    </a:prstGeom>
+                  </pic:spPr>
+                </pic:pic>
+              </a:graphicData>
+            </a:graphic>
+          </wp:inline>
+        </w:drawing>
+      </w:r>
+      <w:r>
+        <w:rPr>
+          <w:rFonts w:ascii="Cambria" w:hAnsi="Cambria"/>
+          <w:b/>
+          <w:bCs/>
+          <w:sz w:val="24"/>
+          <w:szCs w:val="24"/>
+        </w:rPr>
+        <w:br/>
+        <w:t>Although it denied access to the pages I still had to fix this as they shouldn’t know that it is possible in the first place</w:t>
+      </w:r>
+      <w:r>
+        <w:rPr>
+          <w:rFonts w:ascii="Cambria" w:hAnsi="Cambria"/>
+          <w:b/>
+          <w:bCs/>
+          <w:sz w:val="24"/>
+          <w:szCs w:val="24"/>
+        </w:rPr>
+        <w:t>.</w:t>
+      </w:r>
+      <w:r>
+        <w:rPr>
+          <w:rFonts w:ascii="Cambria" w:hAnsi="Cambria"/>
+          <w:b/>
+          <w:bCs/>
+          <w:sz w:val="24"/>
+          <w:szCs w:val="24"/>
+        </w:rPr>
+        <w:br/>
+        <w:t xml:space="preserve">This was a </w:t>
+      </w:r>
+      <w:proofErr w:type="spellStart"/>
+      <w:r>
+        <w:rPr>
+          <w:rFonts w:ascii="Cambria" w:hAnsi="Cambria"/>
+          <w:b/>
+          <w:bCs/>
+          <w:sz w:val="24"/>
+          <w:szCs w:val="24"/>
+        </w:rPr>
+        <w:t>css</w:t>
+      </w:r>
+      <w:proofErr w:type="spellEnd"/>
+      <w:r>
+        <w:rPr>
+          <w:rFonts w:ascii="Cambria" w:hAnsi="Cambria"/>
+          <w:b/>
+          <w:bCs/>
+          <w:sz w:val="24"/>
+          <w:szCs w:val="24"/>
+        </w:rPr>
+        <w:t xml:space="preserve"> issue not checking the users roles while displaying the buttons, fixed by adding checks.</w:t>
+      </w:r>
+      <w:r>
+        <w:rPr>
+          <w:rFonts w:ascii="Cambria" w:hAnsi="Cambria"/>
+          <w:b/>
+          <w:bCs/>
+          <w:sz w:val="24"/>
+          <w:szCs w:val="24"/>
+        </w:rPr>
+        <w:br/>
+      </w:r>
+      <w:r>
+        <w:rPr>
+          <w:rFonts w:ascii="Cambria" w:hAnsi="Cambria"/>
+          <w:b/>
+          <w:bCs/>
+          <w:sz w:val="24"/>
+          <w:szCs w:val="24"/>
+        </w:rPr>
+        <w:br/>
+      </w:r>
+      <w:proofErr w:type="spellStart"/>
+      <w:r>
+        <w:rPr>
+          <w:rFonts w:ascii="Cambria" w:hAnsi="Cambria"/>
+          <w:b/>
+          <w:bCs/>
+          <w:color w:val="FF0000"/>
+          <w:sz w:val="24"/>
+          <w:szCs w:val="24"/>
+        </w:rPr>
+        <w:t>i</w:t>
+      </w:r>
+      <w:proofErr w:type="spellEnd"/>
+      <w:r>
+        <w:rPr>
+          <w:rFonts w:ascii="Cambria" w:hAnsi="Cambria"/>
+          <w:b/>
+          <w:bCs/>
+          <w:color w:val="FF0000"/>
+          <w:sz w:val="24"/>
+          <w:szCs w:val="24"/>
+        </w:rPr>
+        <w:t xml:space="preserve"> was thinking some oranges like a warm welcoming feel with some clean welcoming font </w:t>
+      </w:r>
+      <w:proofErr w:type="spellStart"/>
+      <w:r>
+        <w:rPr>
+          <w:rFonts w:ascii="Cambria" w:hAnsi="Cambria"/>
+          <w:b/>
+          <w:bCs/>
+          <w:color w:val="FF0000"/>
+          <w:sz w:val="24"/>
+          <w:szCs w:val="24"/>
+        </w:rPr>
+        <w:t>aswel</w:t>
+      </w:r>
+      <w:proofErr w:type="spellEnd"/>
+      <w:r>
+        <w:rPr>
+          <w:rFonts w:ascii="Cambria" w:hAnsi="Cambria"/>
+          <w:b/>
+          <w:bCs/>
+          <w:color w:val="FF0000"/>
+          <w:sz w:val="24"/>
+          <w:szCs w:val="24"/>
+        </w:rPr>
+        <w:t xml:space="preserve">, </w:t>
+      </w:r>
+      <w:proofErr w:type="spellStart"/>
+      <w:r>
+        <w:rPr>
+          <w:rFonts w:ascii="Cambria" w:hAnsi="Cambria"/>
+          <w:b/>
+          <w:bCs/>
+          <w:color w:val="FF0000"/>
+          <w:sz w:val="24"/>
+          <w:szCs w:val="24"/>
+        </w:rPr>
+        <w:t>i</w:t>
+      </w:r>
+      <w:proofErr w:type="spellEnd"/>
+      <w:r>
+        <w:rPr>
+          <w:rFonts w:ascii="Cambria" w:hAnsi="Cambria"/>
+          <w:b/>
+          <w:bCs/>
+          <w:color w:val="FF0000"/>
+          <w:sz w:val="24"/>
+          <w:szCs w:val="24"/>
+        </w:rPr>
+        <w:t xml:space="preserve"> wan it very futuristic maybe some blurred glass </w:t>
+      </w:r>
+      <w:proofErr w:type="spellStart"/>
+      <w:r>
+        <w:rPr>
+          <w:rFonts w:ascii="Cambria" w:hAnsi="Cambria"/>
+          <w:b/>
+          <w:bCs/>
+          <w:color w:val="FF0000"/>
+          <w:sz w:val="24"/>
+          <w:szCs w:val="24"/>
+        </w:rPr>
+        <w:t>seperating</w:t>
+      </w:r>
+      <w:proofErr w:type="spellEnd"/>
+      <w:r>
+        <w:rPr>
+          <w:rFonts w:ascii="Cambria" w:hAnsi="Cambria"/>
+          <w:b/>
+          <w:bCs/>
+          <w:color w:val="FF0000"/>
+          <w:sz w:val="24"/>
+          <w:szCs w:val="24"/>
+        </w:rPr>
+        <w:t xml:space="preserve"> cards from the BG even, curved edges</w:t>
+      </w:r>
+    </w:p>
+    <w:p>
+      <w:pPr>
+        <w:rPr>
+          <w:rFonts w:ascii="Cambria" w:hAnsi="Cambria"/>
+          <w:b/>
+          <w:bCs/>
+          <w:color w:val="FF0000"/>
+          <w:sz w:val="24"/>
+          <w:szCs w:val="24"/>
+        </w:rPr>
+      </w:pPr>
+    </w:p>
+    <w:p>
+      <w:pPr>
+        <w:rPr>
+          <w:rFonts w:ascii="Cambria" w:hAnsi="Cambria"/>
+          <w:b/>
+          <w:bCs/>
+          <w:color w:val="FF0000"/>
+          <w:sz w:val="24"/>
+          <w:szCs w:val="24"/>
+        </w:rPr>
+      </w:pPr>
+    </w:p>
+    <w:p>
+      <w:pPr>
+        <w:rPr>
+          <w:rFonts w:ascii="Cambria" w:hAnsi="Cambria"/>
+          <w:b/>
+          <w:bCs/>
+          <w:sz w:val="24"/>
+          <w:szCs w:val="24"/>
+        </w:rPr>
+      </w:pPr>
+      <w:r>
+        <w:rPr>
+          <w:rFonts w:ascii="Cambria" w:hAnsi="Cambria"/>
+          <w:b/>
+          <w:bCs/>
+          <w:color w:val="FF0000"/>
+          <w:sz w:val="24"/>
+          <w:szCs w:val="24"/>
+        </w:rPr>
+        <w:br/>
+      </w:r>
+      <w:r>
+        <w:rPr>
+          <w:rFonts w:ascii="Cambria" w:hAnsi="Cambria"/>
+          <w:b/>
+          <w:bCs/>
+          <w:color w:val="FF0000"/>
+          <w:sz w:val="24"/>
+          <w:szCs w:val="24"/>
+        </w:rPr>
+        <w:br/>
+      </w:r>
+      <w:r>
+        <w:rPr>
+          <w:rFonts w:ascii="Cambria" w:hAnsi="Cambria"/>
+          <w:b/>
+          <w:bCs/>
+          <w:sz w:val="24"/>
+          <w:szCs w:val="24"/>
+        </w:rPr>
+        <w:t>found out that filter by price crashes the solution when only one of the 2 inputs are entered.</w:t>
+      </w:r>
+      <w:r>
+        <w:rPr>
+          <w:rFonts w:ascii="Cambria" w:hAnsi="Cambria"/>
+          <w:b/>
+          <w:bCs/>
+          <w:sz w:val="24"/>
+          <w:szCs w:val="24"/>
+        </w:rPr>
+        <w:br/>
+        <w:t>This is cause because the system was checking if minimum price was input</w:t>
+      </w:r>
+      <w:r>
+        <w:rPr>
+          <w:rFonts w:ascii="Cambria" w:hAnsi="Cambria"/>
+          <w:b/>
+          <w:bCs/>
+          <w:sz w:val="24"/>
+          <w:szCs w:val="24"/>
+        </w:rPr>
+        <w:t xml:space="preserve"> </w:t>
+      </w:r>
+      <w:r>
+        <w:rPr>
+          <w:rFonts w:ascii="Cambria" w:hAnsi="Cambria"/>
+          <w:b/>
+          <w:bCs/>
+          <w:sz w:val="24"/>
+          <w:szCs w:val="24"/>
+        </w:rPr>
+        <w:t>but then filtering by the maximum price, by changing the variable the system then is allowed to check even if the other input is null</w:t>
+      </w:r>
+      <w:r>
+        <w:rPr>
+          <w:rFonts w:ascii="Cambria" w:hAnsi="Cambria"/>
+          <w:b/>
+          <w:bCs/>
+          <w:sz w:val="24"/>
+          <w:szCs w:val="24"/>
+        </w:rPr>
+        <w:t>.</w:t>
+      </w:r>
+      <w:r>
+        <w:rPr>
+          <w:rFonts w:ascii="Cambria" w:hAnsi="Cambria"/>
+          <w:b/>
+          <w:bCs/>
+          <w:sz w:val="24"/>
+          <w:szCs w:val="24"/>
+        </w:rPr>
+        <w:br/>
+      </w:r>
+      <w:r>
+        <w:rPr>
+          <w:rFonts w:ascii="Cambria" w:hAnsi="Cambria"/>
+          <w:b/>
+          <w:bCs/>
+          <w:sz w:val="24"/>
+          <w:szCs w:val="24"/>
+        </w:rPr>
+        <w:drawing>
+          <wp:inline distT="0" distB="0" distL="0" distR="0" wp14:anchorId="5EDCD0EC" wp14:editId="5847DB34">
+            <wp:extent cx="5144218" cy="2591162"/>
+            <wp:effectExtent l="0" t="0" r="0" b="0"/>
+            <wp:docPr id="12" name="Picture 12"/>
+            <wp:cNvGraphicFramePr>
+              <a:graphicFrameLocks xmlns:a="http://schemas.openxmlformats.org/drawingml/2006/main" noChangeAspect="1"/>
+            </wp:cNvGraphicFramePr>
+            <a:graphic xmlns:a="http://schemas.openxmlformats.org/drawingml/2006/main">
+              <a:graphicData uri="http://schemas.openxmlformats.org/drawingml/2006/picture">
+                <pic:pic xmlns:pic="http://schemas.openxmlformats.org/drawingml/2006/picture">
+                  <pic:nvPicPr>
+                    <pic:cNvPr id="1" name=""/>
+                    <pic:cNvPicPr/>
+                  </pic:nvPicPr>
+                  <pic:blipFill>
+                    <a:blip r:embed="rId19"/>
+                    <a:stretch>
+                      <a:fillRect/>
+                    </a:stretch>
+                  </pic:blipFill>
+                  <pic:spPr>
+                    <a:xfrm>
+                      <a:off x="0" y="0"/>
+                      <a:ext cx="5144218" cy="2591162"/>
+                    </a:xfrm>
+                    <a:prstGeom prst="rect">
+                      <a:avLst/>
+                    </a:prstGeom>
+                  </pic:spPr>
+                </pic:pic>
+              </a:graphicData>
+            </a:graphic>
+          </wp:inline>
+        </w:drawing>
+      </w:r>
+      <w:r>
+        <w:rPr>
+          <w:rFonts w:ascii="Cambria" w:hAnsi="Cambria"/>
+          <w:b/>
+          <w:bCs/>
+          <w:sz w:val="24"/>
+          <w:szCs w:val="24"/>
+        </w:rPr>
+        <w:br/>
+      </w:r>
+      <w:r>
+        <w:rPr>
+          <w:rFonts w:ascii="Cambria" w:hAnsi="Cambria"/>
+          <w:b/>
+          <w:bCs/>
+          <w:sz w:val="24"/>
+          <w:szCs w:val="24"/>
+        </w:rPr>
+        <w:br/>
+        <w:t xml:space="preserve"> Today I also properly styled all</w:t>
+      </w:r>
+      <w:r>
+        <w:rPr>
+          <w:rFonts w:ascii="Cambria" w:hAnsi="Cambria"/>
+          <w:b/>
+          <w:bCs/>
+          <w:sz w:val="24"/>
+          <w:szCs w:val="24"/>
+        </w:rPr>
+        <w:br/>
+        <w:t>(staff view)</w:t>
+      </w:r>
+      <w:r>
+        <w:rPr>
+          <w:rFonts w:ascii="Cambria" w:hAnsi="Cambria"/>
+          <w:b/>
+          <w:bCs/>
+          <w:sz w:val="24"/>
+          <w:szCs w:val="24"/>
+        </w:rPr>
+        <w:br/>
+      </w:r>
+      <w:r>
+        <w:rPr>
+          <w:rFonts w:ascii="Cambria" w:hAnsi="Cambria"/>
+          <w:b/>
+          <w:bCs/>
+          <w:sz w:val="24"/>
+          <w:szCs w:val="24"/>
+        </w:rPr>
+        <w:drawing>
+          <wp:inline distT="0" distB="0" distL="0" distR="0" wp14:anchorId="0A6B9F22" wp14:editId="17EF7053">
+            <wp:extent cx="5731510" cy="2786380"/>
+            <wp:effectExtent l="0" t="0" r="2540" b="0"/>
+            <wp:docPr id="16" name="Picture 16"/>
+            <wp:cNvGraphicFramePr>
+              <a:graphicFrameLocks xmlns:a="http://schemas.openxmlformats.org/drawingml/2006/main" noChangeAspect="1"/>
+            </wp:cNvGraphicFramePr>
+            <a:graphic xmlns:a="http://schemas.openxmlformats.org/drawingml/2006/main">
+              <a:graphicData uri="http://schemas.openxmlformats.org/drawingml/2006/picture">
+                <pic:pic xmlns:pic="http://schemas.openxmlformats.org/drawingml/2006/picture">
+                  <pic:nvPicPr>
+                    <pic:cNvPr id="1" name=""/>
+                    <pic:cNvPicPr/>
+                  </pic:nvPicPr>
+                  <pic:blipFill>
+                    <a:blip r:embed="rId20"/>
+                    <a:stretch>
+                      <a:fillRect/>
+                    </a:stretch>
+                  </pic:blipFill>
+                  <pic:spPr>
+                    <a:xfrm>
+                      <a:off x="0" y="0"/>
+                      <a:ext cx="5731510" cy="2786380"/>
+                    </a:xfrm>
+                    <a:prstGeom prst="rect">
+                      <a:avLst/>
+                    </a:prstGeom>
+                  </pic:spPr>
+                </pic:pic>
+              </a:graphicData>
+            </a:graphic>
+          </wp:inline>
+        </w:drawing>
+      </w:r>
+      <w:r>
+        <w:rPr>
+          <w:rFonts w:ascii="Cambria" w:hAnsi="Cambria"/>
+          <w:b/>
+          <w:bCs/>
+          <w:sz w:val="24"/>
+          <w:szCs w:val="24"/>
+        </w:rPr>
+        <w:br/>
+      </w:r>
+      <w:r>
+        <w:rPr>
+          <w:rFonts w:ascii="Cambria" w:hAnsi="Cambria"/>
+          <w:b/>
+          <w:bCs/>
+          <w:sz w:val="24"/>
+          <w:szCs w:val="24"/>
+        </w:rPr>
+        <w:drawing>
+          <wp:inline distT="0" distB="0" distL="0" distR="0" wp14:anchorId="0EFD05B4" wp14:editId="77D598E6">
+            <wp:extent cx="5731510" cy="2792095"/>
+            <wp:effectExtent l="0" t="0" r="2540" b="8255"/>
+            <wp:docPr id="17" name="Picture 17"/>
+            <wp:cNvGraphicFramePr>
+              <a:graphicFrameLocks xmlns:a="http://schemas.openxmlformats.org/drawingml/2006/main" noChangeAspect="1"/>
+            </wp:cNvGraphicFramePr>
+            <a:graphic xmlns:a="http://schemas.openxmlformats.org/drawingml/2006/main">
+              <a:graphicData uri="http://schemas.openxmlformats.org/drawingml/2006/picture">
+                <pic:pic xmlns:pic="http://schemas.openxmlformats.org/drawingml/2006/picture">
+                  <pic:nvPicPr>
+                    <pic:cNvPr id="1" name=""/>
+                    <pic:cNvPicPr/>
+                  </pic:nvPicPr>
+                  <pic:blipFill>
+                    <a:blip r:embed="rId21"/>
+                    <a:stretch>
+                      <a:fillRect/>
+                    </a:stretch>
+                  </pic:blipFill>
+                  <pic:spPr>
+                    <a:xfrm>
+                      <a:off x="0" y="0"/>
+                      <a:ext cx="5731510" cy="2792095"/>
+                    </a:xfrm>
+                    <a:prstGeom prst="rect">
+                      <a:avLst/>
+                    </a:prstGeom>
+                  </pic:spPr>
+                </pic:pic>
+              </a:graphicData>
+            </a:graphic>
+          </wp:inline>
+        </w:drawing>
+      </w:r>
+      <w:r>
+        <w:rPr>
+          <w:rFonts w:ascii="Cambria" w:hAnsi="Cambria"/>
+          <w:b/>
+          <w:bCs/>
+          <w:sz w:val="24"/>
+          <w:szCs w:val="24"/>
+        </w:rPr>
+        <w:br/>
+      </w:r>
+      <w:r>
+        <w:rPr>
+          <w:rFonts w:ascii="Cambria" w:hAnsi="Cambria"/>
+          <w:b/>
+          <w:bCs/>
+          <w:sz w:val="24"/>
+          <w:szCs w:val="24"/>
+        </w:rPr>
+        <w:drawing>
+          <wp:inline distT="0" distB="0" distL="0" distR="0" wp14:anchorId="67DECA13" wp14:editId="600C5770">
+            <wp:extent cx="5731510" cy="2694940"/>
+            <wp:effectExtent l="0" t="0" r="2540" b="0"/>
+            <wp:docPr id="18" name="Picture 18"/>
+            <wp:cNvGraphicFramePr>
+              <a:graphicFrameLocks xmlns:a="http://schemas.openxmlformats.org/drawingml/2006/main" noChangeAspect="1"/>
+            </wp:cNvGraphicFramePr>
+            <a:graphic xmlns:a="http://schemas.openxmlformats.org/drawingml/2006/main">
+              <a:graphicData uri="http://schemas.openxmlformats.org/drawingml/2006/picture">
+                <pic:pic xmlns:pic="http://schemas.openxmlformats.org/drawingml/2006/picture">
+                  <pic:nvPicPr>
+                    <pic:cNvPr id="1" name=""/>
+                    <pic:cNvPicPr/>
+                  </pic:nvPicPr>
+                  <pic:blipFill>
+                    <a:blip r:embed="rId22"/>
+                    <a:stretch>
+                      <a:fillRect/>
+                    </a:stretch>
+                  </pic:blipFill>
+                  <pic:spPr>
+                    <a:xfrm>
+                      <a:off x="0" y="0"/>
+                      <a:ext cx="5731510" cy="2694940"/>
+                    </a:xfrm>
+                    <a:prstGeom prst="rect">
+                      <a:avLst/>
+                    </a:prstGeom>
+                  </pic:spPr>
+                </pic:pic>
+              </a:graphicData>
+            </a:graphic>
+          </wp:inline>
+        </w:drawing>
+      </w:r>
+      <w:r>
+        <w:rPr>
+          <w:rFonts w:ascii="Cambria" w:hAnsi="Cambria"/>
+          <w:b/>
+          <w:bCs/>
+          <w:sz w:val="24"/>
+          <w:szCs w:val="24"/>
+        </w:rPr>
+        <w:br/>
+      </w:r>
+      <w:r>
+        <w:rPr>
+          <w:rFonts w:ascii="Cambria" w:hAnsi="Cambria"/>
+          <w:b/>
+          <w:bCs/>
+          <w:sz w:val="24"/>
+          <w:szCs w:val="24"/>
+        </w:rPr>
+        <w:drawing>
+          <wp:inline distT="0" distB="0" distL="0" distR="0" wp14:anchorId="12293D14" wp14:editId="2D72FA63">
+            <wp:extent cx="5731510" cy="2778760"/>
+            <wp:effectExtent l="0" t="0" r="2540" b="2540"/>
+            <wp:docPr id="20" name="Picture 20"/>
+            <wp:cNvGraphicFramePr>
+              <a:graphicFrameLocks xmlns:a="http://schemas.openxmlformats.org/drawingml/2006/main" noChangeAspect="1"/>
+            </wp:cNvGraphicFramePr>
+            <a:graphic xmlns:a="http://schemas.openxmlformats.org/drawingml/2006/main">
+              <a:graphicData uri="http://schemas.openxmlformats.org/drawingml/2006/picture">
+                <pic:pic xmlns:pic="http://schemas.openxmlformats.org/drawingml/2006/picture">
+                  <pic:nvPicPr>
+                    <pic:cNvPr id="1" name=""/>
+                    <pic:cNvPicPr/>
+                  </pic:nvPicPr>
+                  <pic:blipFill>
+                    <a:blip r:embed="rId23"/>
+                    <a:stretch>
+                      <a:fillRect/>
+                    </a:stretch>
+                  </pic:blipFill>
+                  <pic:spPr>
+                    <a:xfrm>
+                      <a:off x="0" y="0"/>
+                      <a:ext cx="5731510" cy="2778760"/>
+                    </a:xfrm>
+                    <a:prstGeom prst="rect">
+                      <a:avLst/>
+                    </a:prstGeom>
+                  </pic:spPr>
+                </pic:pic>
+              </a:graphicData>
+            </a:graphic>
+          </wp:inline>
+        </w:drawing>
+      </w:r>
+      <w:r>
+        <w:rPr>
+          <w:rFonts w:ascii="Cambria" w:hAnsi="Cambria"/>
+          <w:b/>
+          <w:bCs/>
+          <w:sz w:val="24"/>
+          <w:szCs w:val="24"/>
+        </w:rPr>
+        <w:br/>
+      </w:r>
+      <w:r>
+        <w:rPr>
+          <w:rFonts w:ascii="Cambria" w:hAnsi="Cambria"/>
+          <w:b/>
+          <w:bCs/>
+          <w:sz w:val="24"/>
+          <w:szCs w:val="24"/>
+        </w:rPr>
+        <w:br/>
+      </w:r>
+      <w:r>
+        <w:rPr>
+          <w:rFonts w:ascii="Cambria" w:hAnsi="Cambria"/>
+          <w:b/>
+          <w:bCs/>
+          <w:sz w:val="24"/>
+          <w:szCs w:val="24"/>
+        </w:rPr>
+        <w:br/>
+        <w:t>Also attempted to add Text to speech functionality but it wasn’t working and wasn’t sure how to fix it</w:t>
+      </w:r>
+      <w:r>
+        <w:rPr>
+          <w:rFonts w:ascii="Cambria" w:hAnsi="Cambria"/>
+          <w:b/>
+          <w:bCs/>
+          <w:sz w:val="24"/>
+          <w:szCs w:val="24"/>
+        </w:rPr>
+        <w:t xml:space="preserve"> (no red lines in </w:t>
+      </w:r>
+      <w:proofErr w:type="spellStart"/>
+      <w:r>
+        <w:rPr>
+          <w:rFonts w:ascii="Cambria" w:hAnsi="Cambria"/>
+          <w:b/>
+          <w:bCs/>
+          <w:sz w:val="24"/>
+          <w:szCs w:val="24"/>
+        </w:rPr>
+        <w:t>js</w:t>
+      </w:r>
+      <w:proofErr w:type="spellEnd"/>
+      <w:r>
+        <w:rPr>
+          <w:rFonts w:ascii="Cambria" w:hAnsi="Cambria"/>
+          <w:b/>
+          <w:bCs/>
+          <w:sz w:val="24"/>
+          <w:szCs w:val="24"/>
+        </w:rPr>
+        <w:t xml:space="preserve"> or view)</w:t>
+      </w:r>
+      <w:r>
+        <w:rPr>
+          <w:rFonts w:ascii="Cambria" w:hAnsi="Cambria"/>
+          <w:b/>
+          <w:bCs/>
+          <w:sz w:val="24"/>
+          <w:szCs w:val="24"/>
+        </w:rPr>
+        <w:br/>
+      </w:r>
+      <w:r>
+        <w:rPr>
+          <w:rFonts w:ascii="Cambria" w:hAnsi="Cambria"/>
+          <w:b/>
+          <w:bCs/>
+          <w:sz w:val="24"/>
+          <w:szCs w:val="24"/>
+        </w:rPr>
+        <w:drawing>
+          <wp:inline distT="0" distB="0" distL="0" distR="0" wp14:anchorId="649EBCA4" wp14:editId="38B7DB83">
+            <wp:extent cx="4782217" cy="1619476"/>
+            <wp:effectExtent l="0" t="0" r="0" b="0"/>
+            <wp:docPr id="19" name="Picture 19"/>
+            <wp:cNvGraphicFramePr>
+              <a:graphicFrameLocks xmlns:a="http://schemas.openxmlformats.org/drawingml/2006/main" noChangeAspect="1"/>
+            </wp:cNvGraphicFramePr>
+            <a:graphic xmlns:a="http://schemas.openxmlformats.org/drawingml/2006/main">
+              <a:graphicData uri="http://schemas.openxmlformats.org/drawingml/2006/picture">
+                <pic:pic xmlns:pic="http://schemas.openxmlformats.org/drawingml/2006/picture">
+                  <pic:nvPicPr>
+                    <pic:cNvPr id="1" name=""/>
+                    <pic:cNvPicPr/>
+                  </pic:nvPicPr>
+                  <pic:blipFill>
+                    <a:blip r:embed="rId24"/>
+                    <a:stretch>
+                      <a:fillRect/>
+                    </a:stretch>
+                  </pic:blipFill>
+                  <pic:spPr>
+                    <a:xfrm>
+                      <a:off x="0" y="0"/>
+                      <a:ext cx="4782217" cy="1619476"/>
+                    </a:xfrm>
+                    <a:prstGeom prst="rect">
+                      <a:avLst/>
+                    </a:prstGeom>
+                  </pic:spPr>
+                </pic:pic>
+              </a:graphicData>
+            </a:graphic>
+          </wp:inline>
+        </w:drawing>
+      </w:r>
+      <w:r>
+        <w:rPr>
+          <w:rFonts w:ascii="Cambria" w:hAnsi="Cambria"/>
+          <w:b/>
+          <w:bCs/>
+          <w:sz w:val="24"/>
+          <w:szCs w:val="24"/>
+        </w:rPr>
+        <w:br/>
+      </w:r>
+      <w:r>
+        <w:rPr>
+          <w:rFonts w:ascii="Cambria" w:hAnsi="Cambria"/>
+          <w:b/>
+          <w:bCs/>
+          <w:sz w:val="24"/>
+          <w:szCs w:val="24"/>
+        </w:rPr>
+        <w:br/>
+      </w:r>
+      <w:r>
+        <w:rPr>
+          <w:rFonts w:ascii="Cambria" w:hAnsi="Cambria"/>
+          <w:b/>
+          <w:bCs/>
+          <w:sz w:val="24"/>
+          <w:szCs w:val="24"/>
+        </w:rPr>
+        <w:t>Fully commented all “technical” code</w:t>
       </w:r>
     </w:p>
     <w:sectPr>
@@ -2122,7 +2840,7 @@
 </file>
 
 <file path=word/numbering.xml><?xml version="1.0" encoding="utf-8"?>
-<w:numbering xmlns:wpc="http://schemas.microsoft.com/office/word/2010/wordprocessingCanvas" xmlns:cx="http://schemas.microsoft.com/office/drawing/2014/chartex" xmlns:cx1="http://schemas.microsoft.com/office/drawing/2015/9/8/chartex" xmlns:cx2="http://schemas.microsoft.com/office/drawing/2015/10/21/chartex" xmlns:cx3="http://schemas.microsoft.com/office/drawing/2016/5/9/chartex" xmlns:cx4="http://schemas.microsoft.com/office/drawing/2016/5/10/chartex" xmlns:cx5="http://schemas.microsoft.com/office/drawing/2016/5/11/chartex" xmlns:cx6="http://schemas.microsoft.com/office/drawing/2016/5/12/chartex" xmlns:cx7="http://schemas.microsoft.com/office/drawing/2016/5/13/chartex" xmlns:cx8="http://schemas.microsoft.com/office/drawing/2016/5/14/chartex" xmlns:mc="http://schemas.openxmlformats.org/markup-compatibility/2006" xmlns:aink="http://schemas.microsoft.com/office/drawing/2016/ink" xmlns:am3d="http://schemas.microsoft.com/office/drawing/2017/model3d" xmlns:o="urn:schemas-microsoft-com:office:office" xmlns:r="http://schemas.openxmlformats.org/officeDocument/2006/relationships" xmlns:m="http://schemas.openxmlformats.org/officeDocument/2006/math" xmlns:v="urn:schemas-microsoft-com:vml" xmlns:wp14="http://schemas.microsoft.com/office/word/2010/wordprocessingDrawing" xmlns:wp="http://schemas.openxmlformats.org/drawingml/2006/wordprocessingDrawing" xmlns:w10="urn:schemas-microsoft-com:office:word" xmlns:w="http://schemas.openxmlformats.org/wordprocessingml/2006/main" xmlns:w14="http://schemas.microsoft.com/office/word/2010/wordml" xmlns:w15="http://schemas.microsoft.com/office/word/2012/wordml" xmlns:w16cex="http://schemas.microsoft.com/office/word/2018/wordml/cex" xmlns:w16cid="http://schemas.microsoft.com/office/word/2016/wordml/cid" xmlns:w16="http://schemas.microsoft.com/office/word/2018/wordml" xmlns:w16sdtdh="http://schemas.microsoft.com/office/word/2020/wordml/sdtdatahash" xmlns:w16se="http://schemas.microsoft.com/office/word/2015/wordml/symex" xmlns:wpg="http://schemas.microsoft.com/office/word/2010/wordprocessingGroup" xmlns:wpi="http://schemas.microsoft.com/office/word/2010/wordprocessingInk" xmlns:wne="http://schemas.microsoft.com/office/word/2006/wordml" xmlns:wps="http://schemas.microsoft.com/office/word/2010/wordprocessingShape" mc:Ignorable="w14 w15 w16se w16cid w16 w16cex w16sdtdh wp14">
+<w:numbering xmlns:wpc="http://schemas.microsoft.com/office/word/2010/wordprocessingCanvas" xmlns:cx="http://schemas.microsoft.com/office/drawing/2014/chartex" xmlns:cx1="http://schemas.microsoft.com/office/drawing/2015/9/8/chartex" xmlns:cx2="http://schemas.microsoft.com/office/drawing/2015/10/21/chartex" xmlns:cx3="http://schemas.microsoft.com/office/drawing/2016/5/9/chartex" xmlns:cx4="http://schemas.microsoft.com/office/drawing/2016/5/10/chartex" xmlns:cx5="http://schemas.microsoft.com/office/drawing/2016/5/11/chartex" xmlns:cx6="http://schemas.microsoft.com/office/drawing/2016/5/12/chartex" xmlns:cx7="http://schemas.microsoft.com/office/drawing/2016/5/13/chartex" xmlns:cx8="http://schemas.microsoft.com/office/drawing/2016/5/14/chartex" xmlns:mc="http://schemas.openxmlformats.org/markup-compatibility/2006" xmlns:aink="http://schemas.microsoft.com/office/drawing/2016/ink" xmlns:am3d="http://schemas.microsoft.com/office/drawing/2017/model3d" xmlns:o="urn:schemas-microsoft-com:office:office" xmlns:oel="http://schemas.microsoft.com/office/2019/extlst" xmlns:r="http://schemas.openxmlformats.org/officeDocument/2006/relationships" xmlns:m="http://schemas.openxmlformats.org/officeDocument/2006/math" xmlns:v="urn:schemas-microsoft-com:vml" xmlns:wp14="http://schemas.microsoft.com/office/word/2010/wordprocessingDrawing" xmlns:wp="http://schemas.openxmlformats.org/drawingml/2006/wordprocessingDrawing" xmlns:w10="urn:schemas-microsoft-com:office:word" xmlns:w="http://schemas.openxmlformats.org/wordprocessingml/2006/main" xmlns:w14="http://schemas.microsoft.com/office/word/2010/wordml" xmlns:w15="http://schemas.microsoft.com/office/word/2012/wordml" xmlns:w16cex="http://schemas.microsoft.com/office/word/2018/wordml/cex" xmlns:w16cid="http://schemas.microsoft.com/office/word/2016/wordml/cid" xmlns:w16="http://schemas.microsoft.com/office/word/2018/wordml" xmlns:w16sdtdh="http://schemas.microsoft.com/office/word/2020/wordml/sdtdatahash" xmlns:w16se="http://schemas.microsoft.com/office/word/2015/wordml/symex" xmlns:wpg="http://schemas.microsoft.com/office/word/2010/wordprocessingGroup" xmlns:wpi="http://schemas.microsoft.com/office/word/2010/wordprocessingInk" xmlns:wne="http://schemas.microsoft.com/office/word/2006/wordml" xmlns:wps="http://schemas.microsoft.com/office/word/2010/wordprocessingShape" mc:Ignorable="w14 w15 w16se w16cid w16 w16cex w16sdtdh wp14">
   <w:abstractNum w:abstractNumId="0" w15:restartNumberingAfterBreak="0">
     <w:nsid w:val="0EBD2B97"/>
     <w:multiLevelType w:val="hybridMultilevel"/>
@@ -2381,13 +3099,13 @@
       </w:pPr>
     </w:lvl>
   </w:abstractNum>
-  <w:num w:numId="1">
+  <w:num w:numId="1" w16cid:durableId="1708752620">
     <w:abstractNumId w:val="0"/>
   </w:num>
-  <w:num w:numId="2">
+  <w:num w:numId="2" w16cid:durableId="545871597">
     <w:abstractNumId w:val="2"/>
   </w:num>
-  <w:num w:numId="3">
+  <w:num w:numId="3" w16cid:durableId="708379702">
     <w:abstractNumId w:val="1"/>
   </w:num>
 </w:numbering>
@@ -2795,7 +3513,6 @@
   <w:style w:type="character" w:default="1" w:styleId="DefaultParagraphFont">
     <w:name w:val="Default Paragraph Font"/>
     <w:uiPriority w:val="1"/>
-    <w:semiHidden/>
     <w:unhideWhenUsed/>
   </w:style>
   <w:style w:type="table" w:default="1" w:styleId="TableNormal">

</xml_diff>